<commit_message>
docs(sandsea): finalize merged report and archive P1-P5 cycle plan
</commit_message>
<xml_diff>
--- a/docs/releases/SANDSEA-CONVERSATION-REPORT-2026-09-30.docx
+++ b/docs/releases/SANDSEA-CONVERSATION-REPORT-2026-09-30.docx
@@ -194,7 +194,7 @@
                 <w:color w:val="2D363D"/>
                 <w:sz w:val="17"/>
               </w:rPr>
-              <w:t>仅点测文档和 P1 测量工具，已推送，开放待审；未合并</w:t>
+              <w:t>点测指南、P1 测量工具、Word 报告和工程技能均已合并；SHA b0d651749c84e00e5e260463b0655327038417e2</w:t>
             </w:r>
           </w:p>
         </w:tc>
@@ -239,7 +239,7 @@
                 <w:color w:val="2D363D"/>
                 <w:sz w:val="17"/>
               </w:rPr>
-              <w:t>合并后 main：默认与 seed=424242 均 362/362 PASS；对比器 6/6 合成夹具</w:t>
+              <w:t>PR #52 合并后 main：默认与 seed=424242 均 362/362 PASS；对比器 6/6 合成夹具</w:t>
             </w:r>
           </w:p>
         </w:tc>
@@ -306,7 +306,7 @@
         <w:pStyle w:val="Caption"/>
       </w:pPr>
       <w:r>
-        <w:t>说明：本报告汇总截至 2026-09-30 的该轮对话与仓库记录；后续 GitHub 状态应以实时 PR/Issue 和 main 为准。</w:t>
+        <w:t>说明：本报告于 PR #52 合并后更新；后续 GitHub 状态仍以实时 PR/Issue 和 main 为准。</w:t>
       </w:r>
     </w:p>
     <w:p>
@@ -850,7 +850,7 @@
                 <w:color w:val="2D363D"/>
                 <w:sz w:val="17"/>
               </w:rPr>
-              <w:t>#52  未合并</w:t>
+              <w:t>#52  已合并</w:t>
             </w:r>
           </w:p>
         </w:tc>
@@ -869,7 +869,7 @@
                 <w:color w:val="2D363D"/>
                 <w:sz w:val="17"/>
               </w:rPr>
-              <w:t>PR #51 合并后点测标准；P1 基线、设备 monitor、对比器和模拟单元测试。</w:t>
+              <w:t>PR #51 点测标准；P1 基线、设备 monitor、对比器、Word 总报告和技能归档。</w:t>
             </w:r>
           </w:p>
         </w:tc>
@@ -888,7 +888,7 @@
                 <w:color w:val="2D363D"/>
                 <w:sz w:val="17"/>
               </w:rPr>
-              <w:t>仅文档/工具；6/6 合成夹具 + 短采样接口 smoke。</w:t>
+              <w:t>无游戏源码改动；6/6 合成夹具 + 短采样接口 smoke。</w:t>
             </w:r>
           </w:p>
         </w:tc>
@@ -2168,7 +2168,7 @@
                 <w:color w:val="2D363D"/>
                 <w:sz w:val="17"/>
               </w:rPr>
-              <w:t>PR #51 已合并；main 回归 362/362×2；PR #52 已推送且未合并；测量比较器 6/6 合成夹具通过。</w:t>
+              <w:t>PR #51/#52 均已合并；main 回归 362/362×2；测量比较器 6/6 合成夹具通过。</w:t>
             </w:r>
           </w:p>
         </w:tc>
@@ -2256,7 +2256,7 @@
                 <w:color w:val="2D363D"/>
                 <w:sz w:val="17"/>
               </w:rPr>
-              <w:t>优先由测试者在真实设备执行点测，整理 P0/P1/P2 问题；审阅 PR #52 文档与工具。若想合并 #52，须另行明确授权。</w:t>
+              <w:t>优先在真实设备执行 A1–A7 点测并测同机基线；只有复现问题才另行认领 P1 战斗改码并提交独立 PR。</w:t>
             </w:r>
           </w:p>
         </w:tc>
@@ -2269,7 +2269,7 @@
     </w:p>
     <w:p>
       <w:r>
-        <w:t>配套交付：PR #52 内含可逐项打勾的点测清单、P1 技术测量方案与工具源码；Issue #11 完工交接保留给其他 AI。沙海奇境工程循环技能保存在本会话 Sandbox 的 sandsea-iteration/SKILL.md，可供后续按同一流程认领、测试、截图、文档与 PR。</w:t>
+        <w:t>配套交付：PR #52 已把点测清单、P1 测量工具、Word 报告和 sandsea-iteration 技能归档于仓库；更详细的 P1–P5 任务拆解见 docs/SANDSEA-P1-P5-NEXT-CYCLE-PLAN-2026-09-30.md。Issue #11 记录各 AI 的最新认领与合并交接。</w:t>
       </w:r>
     </w:p>
     <w:p>
@@ -2318,7 +2318,7 @@
             <w:color w:val="99601C"/>
             <w:u w:val="single"/>
           </w:rPr>
-          <w:t>PR #52：点测文档与 P1 工具（未合并）</w:t>
+          <w:t>PR #52：点测文档与 P1 工具（已合并）</w:t>
         </w:r>
       </w:hyperlink>
     </w:p>

</xml_diff>